<commit_message>
Agents créés (histoire, français, orientation) et note mise à jour
- voix.js : identifiants des trois agents créés dans le compte personnel
- agents.json : Perle pour le français (Léa formatrice retirée de la bibliothèque), Antoine pour les maths (Paul K refusé : modération en direct)
- created.json : identifiants des bases de connaissances, outils et agents, pour que les relances mettent à jour sans doublon
- note : lien GitHub Pages inexistant remplacé par la Boussole IA des formations

Co-Authored-By: Claude Opus 5.5 <noreply@anthropic.com>
Claude-Session: https://claude.ai/code/session_019A5dK6NMgbAXLcACYeg2DH
</commit_message>
<xml_diff>
--- a/note/EDUCATION-tuteur-ia.docx
+++ b/note/EDUCATION-tuteur-ia.docx
@@ -509,7 +509,32 @@
           <w:sz w:val="18"/>
           <w:szCs w:val="18"/>
         </w:rPr>
-        <w:t xml:space="preserve">* Prototype : https://ajoly35.github.io/tuteur-ia/ (tuteur de révision et guide d'orientation, liens de test).</w:t>
+        <w:t xml:space="preserve">Pour essayer : la </w:t>
+      </w:r>
+      <w:hyperlink r:id="rIdLink1" w:history="1">
+        <w:r>
+          <w:rPr>
+            <w:rFonts w:ascii="Calibri" w:eastAsia="Calibri" w:hAnsi="Calibri" w:cs="Calibri"/>
+            <w:i/>
+            <w:iCs/>
+            <w:color w:val="1F5FAD"/>
+            <w:sz w:val="18"/>
+            <w:szCs w:val="18"/>
+            <w:u w:val="single"/>
+          </w:rPr>
+          <w:t xml:space="preserve">Boussole IA des formations</w:t>
+        </w:r>
+      </w:hyperlink>
+      <w:r>
+        <w:rPr>
+          <w:rFonts w:ascii="Calibri" w:eastAsia="Calibri" w:hAnsi="Calibri" w:cs="Calibri"/>
+          <w:i/>
+          <w:iCs/>
+          <w:color w:val="595959"/>
+          <w:sz w:val="18"/>
+          <w:szCs w:val="18"/>
+        </w:rPr>
+        <w:t xml:space="preserve">, qui classe les formations de Parcoursup selon leur résilience à l'IA. Le tuteur vocal et la guide d'orientation sont en cours de mise en ligne.</w:t>
       </w:r>
     </w:p>
     <w:p>

</xml_diff>

<commit_message>
Agent de maths, plafonds de coût et Boussole hébergée
- voix.js : identifiant de l'agent de maths (Monsieur Diallo, voix Antoine) ; les quatre personnages sont branchés
- create_agents.py : conversations de 10 min au plus, 20 conversations par jour et 2 simultanées par agent, sans dépassement payant
- site/boussole/ : la Boussole IA des formations (page et données), accessible sans compte ; carte ajoutée sur la page d'accueil
- note : liens de test du prototype et lien vers la Boussole hébergée

Co-Authored-By: Claude Opus 5.5 <noreply@anthropic.com>
Claude-Session: https://claude.ai/code/session_019A5dK6NMgbAXLcACYeg2DH
</commit_message>
<xml_diff>
--- a/note/EDUCATION-tuteur-ia.docx
+++ b/note/EDUCATION-tuteur-ia.docx
@@ -534,7 +534,182 @@
           <w:sz w:val="18"/>
           <w:szCs w:val="18"/>
         </w:rPr>
-        <w:t xml:space="preserve">, qui classe les formations de Parcoursup selon leur résilience à l'IA. Le tuteur vocal et la guide d'orientation sont en cours de mise en ligne.</w:t>
+        <w:t xml:space="preserve">, qui classe les formations de Parcoursup selon leur résilience à l'IA. Le prototype vocal : </w:t>
+      </w:r>
+      <w:hyperlink r:id="rIdLink2" w:history="1">
+        <w:r>
+          <w:rPr>
+            <w:rFonts w:ascii="Calibri" w:eastAsia="Calibri" w:hAnsi="Calibri" w:cs="Calibri"/>
+            <w:i/>
+            <w:iCs/>
+            <w:color w:val="1F5FAD"/>
+            <w:sz w:val="18"/>
+            <w:szCs w:val="18"/>
+            <w:u w:val="single"/>
+          </w:rPr>
+          <w:t xml:space="preserve">le tuteur de révision</w:t>
+        </w:r>
+      </w:hyperlink>
+      <w:r>
+        <w:rPr>
+          <w:rFonts w:ascii="Calibri" w:eastAsia="Calibri" w:hAnsi="Calibri" w:cs="Calibri"/>
+          <w:i/>
+          <w:iCs/>
+          <w:color w:val="595959"/>
+          <w:sz w:val="18"/>
+          <w:szCs w:val="18"/>
+        </w:rPr>
+        <w:t xml:space="preserve"> (histoire-géographie et français ; mathématiques à venir) et </w:t>
+      </w:r>
+      <w:hyperlink r:id="rIdLink3" w:history="1">
+        <w:r>
+          <w:rPr>
+            <w:rFonts w:ascii="Calibri" w:eastAsia="Calibri" w:hAnsi="Calibri" w:cs="Calibri"/>
+            <w:i/>
+            <w:iCs/>
+            <w:color w:val="1F5FAD"/>
+            <w:sz w:val="18"/>
+            <w:szCs w:val="18"/>
+            <w:u w:val="single"/>
+          </w:rPr>
+          <w:t xml:space="preserve">la guide d'orientation</w:t>
+        </w:r>
+      </w:hyperlink>
+      <w:r>
+        <w:rPr>
+          <w:rFonts w:ascii="Calibri" w:eastAsia="Calibri" w:hAnsi="Calibri" w:cs="Calibri"/>
+          <w:i/>
+          <w:iCs/>
+          <w:color w:val="595959"/>
+          <w:sz w:val="18"/>
+          <w:szCs w:val="18"/>
+        </w:rPr>
+        <w:t xml:space="preserve">. Scénarios de test : </w:t>
+      </w:r>
+      <w:hyperlink r:id="rIdLink4" w:history="1">
+        <w:r>
+          <w:rPr>
+            <w:rFonts w:ascii="Calibri" w:eastAsia="Calibri" w:hAnsi="Calibri" w:cs="Calibri"/>
+            <w:i/>
+            <w:iCs/>
+            <w:color w:val="1F5FAD"/>
+            <w:sz w:val="18"/>
+            <w:szCs w:val="18"/>
+            <w:u w:val="single"/>
+          </w:rPr>
+          <w:t xml:space="preserve">Madame Lambert interroge sur la guerre froide</w:t>
+        </w:r>
+      </w:hyperlink>
+      <w:r>
+        <w:rPr>
+          <w:rFonts w:ascii="Calibri" w:eastAsia="Calibri" w:hAnsi="Calibri" w:cs="Calibri"/>
+          <w:i/>
+          <w:iCs/>
+          <w:color w:val="595959"/>
+          <w:sz w:val="18"/>
+          <w:szCs w:val="18"/>
+        </w:rPr>
+        <w:t xml:space="preserve"> ; </w:t>
+      </w:r>
+      <w:hyperlink r:id="rIdLink5" w:history="1">
+        <w:r>
+          <w:rPr>
+            <w:rFonts w:ascii="Calibri" w:eastAsia="Calibri" w:hAnsi="Calibri" w:cs="Calibri"/>
+            <w:i/>
+            <w:iCs/>
+            <w:color w:val="1F5FAD"/>
+            <w:sz w:val="18"/>
+            <w:szCs w:val="18"/>
+            <w:u w:val="single"/>
+          </w:rPr>
+          <w:t xml:space="preserve">Madame Morel prépare l'oral du brevet</w:t>
+        </w:r>
+      </w:hyperlink>
+      <w:r>
+        <w:rPr>
+          <w:rFonts w:ascii="Calibri" w:eastAsia="Calibri" w:hAnsi="Calibri" w:cs="Calibri"/>
+          <w:i/>
+          <w:iCs/>
+          <w:color w:val="595959"/>
+          <w:sz w:val="18"/>
+          <w:szCs w:val="18"/>
+        </w:rPr>
+        <w:t xml:space="preserve"> ; </w:t>
+      </w:r>
+      <w:hyperlink r:id="rIdLink6" w:history="1">
+        <w:r>
+          <w:rPr>
+            <w:rFonts w:ascii="Calibri" w:eastAsia="Calibri" w:hAnsi="Calibri" w:cs="Calibri"/>
+            <w:i/>
+            <w:iCs/>
+            <w:color w:val="1F5FAD"/>
+            <w:sz w:val="18"/>
+            <w:szCs w:val="18"/>
+            <w:u w:val="single"/>
+          </w:rPr>
+          <w:t xml:space="preserve">Claire conseille un élève de 3e à Vire</w:t>
+        </w:r>
+      </w:hyperlink>
+      <w:r>
+        <w:rPr>
+          <w:rFonts w:ascii="Calibri" w:eastAsia="Calibri" w:hAnsi="Calibri" w:cs="Calibri"/>
+          <w:i/>
+          <w:iCs/>
+          <w:color w:val="595959"/>
+          <w:sz w:val="18"/>
+          <w:szCs w:val="18"/>
+        </w:rPr>
+        <w:t xml:space="preserve"> ; </w:t>
+      </w:r>
+      <w:hyperlink r:id="rIdLink7" w:history="1">
+        <w:r>
+          <w:rPr>
+            <w:rFonts w:ascii="Calibri" w:eastAsia="Calibri" w:hAnsi="Calibri" w:cs="Calibri"/>
+            <w:i/>
+            <w:iCs/>
+            <w:color w:val="1F5FAD"/>
+            <w:sz w:val="18"/>
+            <w:szCs w:val="18"/>
+            <w:u w:val="single"/>
+          </w:rPr>
+          <w:t xml:space="preserve">Claire répond à un parent de Guéret</w:t>
+        </w:r>
+      </w:hyperlink>
+      <w:r>
+        <w:rPr>
+          <w:rFonts w:ascii="Calibri" w:eastAsia="Calibri" w:hAnsi="Calibri" w:cs="Calibri"/>
+          <w:i/>
+          <w:iCs/>
+          <w:color w:val="595959"/>
+          <w:sz w:val="18"/>
+          <w:szCs w:val="18"/>
+        </w:rPr>
+        <w:t xml:space="preserve"> ; </w:t>
+      </w:r>
+      <w:hyperlink r:id="rIdLink8" w:history="1">
+        <w:r>
+          <w:rPr>
+            <w:rFonts w:ascii="Calibri" w:eastAsia="Calibri" w:hAnsi="Calibri" w:cs="Calibri"/>
+            <w:i/>
+            <w:iCs/>
+            <w:color w:val="1F5FAD"/>
+            <w:sz w:val="18"/>
+            <w:szCs w:val="18"/>
+            <w:u w:val="single"/>
+          </w:rPr>
+          <w:t xml:space="preserve">tous les scénarios</w:t>
+        </w:r>
+      </w:hyperlink>
+      <w:r>
+        <w:rPr>
+          <w:rFonts w:ascii="Calibri" w:eastAsia="Calibri" w:hAnsi="Calibri" w:cs="Calibri"/>
+          <w:i/>
+          <w:iCs/>
+          <w:color w:val="595959"/>
+          <w:sz w:val="18"/>
+          <w:szCs w:val="18"/>
+        </w:rPr>
+        <w:t xml:space="preserve">. Il faut un micro et accepter son usage dans le navigateur.</w:t>
       </w:r>
     </w:p>
     <w:p>

</xml_diff>

<commit_message>
Tuteurs : programmes officiels de la 6e à la terminale
- 20 fiches de programme (BO, année 2026-2027) : maths et histoire-géo-EMC 6e-terminale, français 6e-première, recherchées par RAG.
- Page du tuteur : choix de la classe, sujets et premières questions par classe (sujets.js).
- Prompts : le tuteur interroge sur le programme de la classe de l'élève, jamais au-delà.
- Note mise à jour (md, docx, pdf) ; trois nouveaux scénarios de test.

Co-Authored-By: Claude Opus 5.5 <noreply@anthropic.com>
Claude-Session: https://claude.ai/code/session_019A5dK6NMgbAXLcACYeg2DH
</commit_message>
<xml_diff>
--- a/note/EDUCATION-tuteur-ia.docx
+++ b/note/EDUCATION-tuteur-ia.docx
@@ -258,7 +258,7 @@
           <w:sz w:val="18"/>
           <w:szCs w:val="18"/>
         </w:rPr>
-        <w:t xml:space="preserve"> qui lui fait expliquer la leçon avec ses mots. Se tester fixe mieux une notion que la relire (Roediger et Karpicke, 2006).</w:t>
+        <w:t xml:space="preserve"> qui lui fait expliquer la leçon avec ses mots. Dès le premier clic, le tuteur pose une question sur le sujet choisi, puis relance (« pourquoi ? », « donne un exemple ») comme un professeur qui interroge sa classe. Se tester fixe mieux une notion que la relire (Roediger et Karpicke, 2006).</w:t>
       </w:r>
     </w:p>
     <w:p>
@@ -286,7 +286,35 @@
           <w:sz w:val="18"/>
           <w:szCs w:val="18"/>
         </w:rPr>
-        <w:t xml:space="preserve"> À l'oral, l'élève est actif et n'a pas besoin de bien lire. Le prototype propose trois professeurs pour le brevet : histoire-géographie (les repères à connaître par cœur), mathématiques (calcul mental) et français (grammaire, récitation, oral du brevet). Un professeur peut y mettre sa propre voix clonée, avec son accord écrit. Le tuteur parle français et passe à l'anglais en cours de conversation si l'élève ou un parent le demande. Le seul outil vocal acheté par l'État, Mathia (P2IA, cycle 2), n'a jamais été évalué publiquement.</w:t>
+        <w:t xml:space="preserve"> À l'oral, l'élève est actif et n'a pas besoin de bien lire. Le prototype couvre l'histoire-géographie-EMC et les mathématiques de la 6e à la terminale, et le français de la 6e à la première. Un professeur peut y mettre sa propre voix clonée, avec son accord écrit. Le tuteur parle français et passe à l'anglais en cours de conversation si l'élève ou un parent le demande. Le seul outil vocal acheté par l'État, Mathia (P2IA, cycle 2), n'a jamais été évalué publiquement.</w:t>
+      </w:r>
+    </w:p>
+    <w:p>
+      <w:pPr>
+        <w:pStyle w:val="ListParagraph"/>
+        <w:numPr>
+          <w:ilvl w:val="0"/>
+          <w:numId w:val="2"/>
+        </w:numPr>
+        <w:spacing w:after="10" w:line="226" w:lineRule="auto"/>
+      </w:pPr>
+      <w:r>
+        <w:rPr>
+          <w:rFonts w:ascii="Calibri" w:eastAsia="Calibri" w:hAnsi="Calibri" w:cs="Calibri"/>
+          <w:b/>
+          <w:bCs/>
+          <w:sz w:val="18"/>
+          <w:szCs w:val="18"/>
+        </w:rPr>
+        <w:t xml:space="preserve">Le programme officiel de chaque classe.</w:t>
+      </w:r>
+      <w:r>
+        <w:rPr>
+          <w:rFonts w:ascii="Calibri" w:eastAsia="Calibri" w:hAnsi="Calibri" w:cs="Calibri"/>
+          <w:sz w:val="18"/>
+          <w:szCs w:val="18"/>
+        </w:rPr>
+        <w:t xml:space="preserve"> Le tuteur s'appuie sur le texte des programmes en vigueur en 2026-2027 (Bulletin officiel), une fiche par matière et par classe : 20 fiches, y compris les programmes réécrits depuis 2025 (maths et français en 6e et 5e, maths en seconde et en première, EMC) et les œuvres du bac de français. Il cherche dans la fiche de la classe de l'élève avant de l'interroger, et ne l'interroge jamais sur une notion d'une classe supérieure. Les programmes changent chaque année jusqu'en 2028 : il suffit de remplacer la fiche.</w:t>
       </w:r>
     </w:p>
     <w:p>
@@ -597,7 +625,7 @@
             <w:szCs w:val="18"/>
             <w:u w:val="single"/>
           </w:rPr>
-          <w:t xml:space="preserve">Madame Lambert interroge sur la guerre froide</w:t>
+          <w:t xml:space="preserve">interrogation sur la guerre froide</w:t>
         </w:r>
       </w:hyperlink>
       <w:r>
@@ -622,7 +650,7 @@
             <w:szCs w:val="18"/>
             <w:u w:val="single"/>
           </w:rPr>
-          <w:t xml:space="preserve">Madame Morel prépare l'oral du brevet</w:t>
+          <w:t xml:space="preserve">répétition de l'oral du brevet</w:t>
         </w:r>
       </w:hyperlink>
       <w:r>

</xml_diff>

<commit_message>
Tutor: question board, guillemets, gentler slower voice, tutor feedback
- Question board on the page, filled by the agent (client tool afficher_question);
  quoted phrases set apart, French non-breaking spaces.
- Quoted sentences and words in the French question bank in « ».
- Tone adapted to age (6e-5e, 4e-3e, lycée), softer feedback phrases,
  TTS speed 0.78 and stability 0.6.
- Tutor role: progress check (what is known, what to revise, where in the
  manual without invented page numbers, study tips) and an on-screen summary
  card (client tool afficher_bilan).
- Note: evaluation section listing the three research proposals.

Co-Authored-By: Claude Opus 5.5 <noreply@anthropic.com>
Claude-Session: https://claude.ai/code/session_019A5dK6NMgbAXLcACYeg2DH
</commit_message>
<xml_diff>
--- a/note/EDUCATION-tuteur-ia.docx
+++ b/note/EDUCATION-tuteur-ia.docx
@@ -738,6 +738,122 @@
           <w:szCs w:val="18"/>
         </w:rPr>
         <w:t xml:space="preserve">. Il faut un micro et accepter son usage dans le navigateur.</w:t>
+      </w:r>
+    </w:p>
+    <w:p>
+      <w:pPr>
+        <w:pBdr>
+          <w:bottom w:val="single" w:sz="6" w:space="1" w:color="1F3A5F"/>
+        </w:pBdr>
+        <w:spacing w:before="100" w:after="40"/>
+      </w:pPr>
+      <w:r>
+        <w:rPr>
+          <w:rFonts w:ascii="Calibri" w:eastAsia="Calibri" w:hAnsi="Calibri" w:cs="Calibri"/>
+          <w:b/>
+          <w:bCs/>
+          <w:color w:val="1F3A5F"/>
+          <w:sz w:val="21"/>
+          <w:szCs w:val="21"/>
+        </w:rPr>
+        <w:t xml:space="preserve">Évaluation : trois propositions de recherche</w:t>
+      </w:r>
+    </w:p>
+    <w:p>
+      <w:pPr>
+        <w:spacing w:after="10"/>
+      </w:pPr>
+      <w:r>
+        <w:rPr>
+          <w:rFonts w:ascii="Calibri" w:eastAsia="Calibri" w:hAnsi="Calibri" w:cs="Calibri"/>
+          <w:sz w:val="18"/>
+          <w:szCs w:val="18"/>
+        </w:rPr>
+        <w:t xml:space="preserve">Chaque mesure est testée avant toute généralisation (propositions de recherche d'une page, jointes) :</w:t>
+      </w:r>
+    </w:p>
+    <w:p>
+      <w:pPr>
+        <w:pStyle w:val="ListParagraph"/>
+        <w:numPr>
+          <w:ilvl w:val="0"/>
+          <w:numId w:val="2"/>
+        </w:numPr>
+        <w:spacing w:after="10" w:line="226" w:lineRule="auto"/>
+      </w:pPr>
+      <w:r>
+        <w:rPr>
+          <w:rFonts w:ascii="Calibri" w:eastAsia="Calibri" w:hAnsi="Calibri" w:cs="Calibri"/>
+          <w:b/>
+          <w:bCs/>
+          <w:sz w:val="18"/>
+          <w:szCs w:val="18"/>
+        </w:rPr>
+        <w:t xml:space="preserve">Le tuteur IA.</w:t>
+      </w:r>
+      <w:r>
+        <w:rPr>
+          <w:rFonts w:ascii="Calibri" w:eastAsia="Calibri" w:hAnsi="Calibri" w:cs="Calibri"/>
+          <w:sz w:val="18"/>
+          <w:szCs w:val="18"/>
+        </w:rPr>
+        <w:t xml:space="preserve"> Un essai randomisé dans environ 150 collèges et lycées en 2027-2028, avec un groupe témoin ; généralisation seulement si l'effet mesuré sur les épreuves passées sans l'outil dépasse un seuil fixé d'avance.</w:t>
+      </w:r>
+    </w:p>
+    <w:p>
+      <w:pPr>
+        <w:pStyle w:val="ListParagraph"/>
+        <w:numPr>
+          <w:ilvl w:val="0"/>
+          <w:numId w:val="2"/>
+        </w:numPr>
+        <w:spacing w:after="10" w:line="226" w:lineRule="auto"/>
+      </w:pPr>
+      <w:r>
+        <w:rPr>
+          <w:rFonts w:ascii="Calibri" w:eastAsia="Calibri" w:hAnsi="Calibri" w:cs="Calibri"/>
+          <w:b/>
+          <w:bCs/>
+          <w:sz w:val="18"/>
+          <w:szCs w:val="18"/>
+        </w:rPr>
+        <w:t xml:space="preserve">Les groupes de niveau.</w:t>
+      </w:r>
+      <w:r>
+        <w:rPr>
+          <w:rFonts w:ascii="Calibri" w:eastAsia="Calibri" w:hAnsi="Calibri" w:cs="Calibri"/>
+          <w:sz w:val="18"/>
+          <w:szCs w:val="18"/>
+        </w:rPr>
+        <w:t xml:space="preserve"> Un essai randomisé dans environ 150 collèges volontaires, en 6e puis 5e, de 2027 à 2029 : groupes par compétence, avec ou sans tutorat par trois, contre classes hétérogènes ; le tiers le plus faible est un critère principal.</w:t>
+      </w:r>
+    </w:p>
+    <w:p>
+      <w:pPr>
+        <w:pStyle w:val="ListParagraph"/>
+        <w:numPr>
+          <w:ilvl w:val="0"/>
+          <w:numId w:val="2"/>
+        </w:numPr>
+        <w:spacing w:after="10" w:line="226" w:lineRule="auto"/>
+      </w:pPr>
+      <w:r>
+        <w:rPr>
+          <w:rFonts w:ascii="Calibri" w:eastAsia="Calibri" w:hAnsi="Calibri" w:cs="Calibri"/>
+          <w:b/>
+          <w:bCs/>
+          <w:sz w:val="18"/>
+          <w:szCs w:val="18"/>
+        </w:rPr>
+        <w:t xml:space="preserve">L'orientation.</w:t>
+      </w:r>
+      <w:r>
+        <w:rPr>
+          <w:rFonts w:ascii="Calibri" w:eastAsia="Calibri" w:hAnsi="Calibri" w:cs="Calibri"/>
+          <w:sz w:val="18"/>
+          <w:szCs w:val="18"/>
+        </w:rPr>
+        <w:t xml:space="preserve"> Un indice d'exposition à l'IA générative par formation, construit sur InserSup et validé sur les embauches réelles, et une guide d'orientation IA évaluée par un essai randomisé dans environ 240 collèges et lycées, en 3e, 2nde et terminale.</w:t>
       </w:r>
     </w:p>
     <w:p>

</xml_diff>